<commit_message>
Restore BIZ UDP Gothic in published newsletters
</commit_message>
<xml_diff>
--- a/downloads/liberest-newsletter-2026-09-17.docx
+++ b/downloads/liberest-newsletter-2026-09-17.docx
@@ -77,7 +77,7 @@
             </w:pPr>
             <w:r>
               <w:rPr>
-                <w:rFonts w:ascii="BIZ UDゴシック" w:hAnsi="BIZ UDゴシック" w:eastAsia="BIZ UDゴシック" w:cs="BIZ UDゴシック"/>
+                <w:rFonts w:ascii="BIZ UDPゴシック" w:hAnsi="BIZ UDPゴシック" w:eastAsia="BIZ UDPゴシック" w:cs="BIZ UDPゴシック"/>
                 <w:b/>
                 <w:color w:val="2F5B54"/>
                 <w:sz w:val="32"/>
@@ -91,7 +91,7 @@
             </w:pPr>
             <w:r>
               <w:rPr>
-                <w:rFonts w:ascii="BIZ UDゴシック" w:hAnsi="BIZ UDゴシック" w:eastAsia="BIZ UDゴシック" w:cs="BIZ UDゴシック"/>
+                <w:rFonts w:ascii="BIZ UDPゴシック" w:hAnsi="BIZ UDPゴシック" w:eastAsia="BIZ UDPゴシック" w:cs="BIZ UDPゴシック"/>
                 <w:b w:val="0"/>
                 <w:color w:val="8C837B"/>
                 <w:sz w:val="18"/>
@@ -111,7 +111,7 @@
             </w:pPr>
             <w:r>
               <w:rPr>
-                <w:rFonts w:ascii="BIZ UDゴシック" w:hAnsi="BIZ UDゴシック" w:eastAsia="BIZ UDゴシック" w:cs="BIZ UDゴシック"/>
+                <w:rFonts w:ascii="BIZ UDPゴシック" w:hAnsi="BIZ UDPゴシック" w:eastAsia="BIZ UDPゴシック" w:cs="BIZ UDPゴシック"/>
                 <w:b/>
                 <w:color w:val="8C6A3E"/>
                 <w:sz w:val="22"/>
@@ -126,7 +126,7 @@
             </w:pPr>
             <w:r>
               <w:rPr>
-                <w:rFonts w:ascii="BIZ UDゴシック" w:hAnsi="BIZ UDゴシック" w:eastAsia="BIZ UDゴシック" w:cs="BIZ UDゴシック"/>
+                <w:rFonts w:ascii="BIZ UDPゴシック" w:hAnsi="BIZ UDPゴシック" w:eastAsia="BIZ UDPゴシック" w:cs="BIZ UDPゴシック"/>
                 <w:b w:val="0"/>
                 <w:color w:val="8C837B"/>
                 <w:sz w:val="18"/>
@@ -141,7 +141,7 @@
             </w:pPr>
             <w:r>
               <w:rPr>
-                <w:rFonts w:ascii="BIZ UDゴシック" w:hAnsi="BIZ UDゴシック" w:eastAsia="BIZ UDゴシック" w:cs="BIZ UDゴシック"/>
+                <w:rFonts w:ascii="BIZ UDPゴシック" w:hAnsi="BIZ UDPゴシック" w:eastAsia="BIZ UDPゴシック" w:cs="BIZ UDPゴシック"/>
                 <w:b w:val="0"/>
                 <w:color w:val="8C837B"/>
                 <w:sz w:val="18"/>
@@ -158,7 +158,7 @@
       </w:pPr>
       <w:r>
         <w:rPr>
-          <w:rFonts w:ascii="BIZ UDゴシック" w:hAnsi="BIZ UDゴシック" w:eastAsia="BIZ UDゴシック" w:cs="BIZ UDゴシック"/>
+          <w:rFonts w:ascii="BIZ UDPゴシック" w:hAnsi="BIZ UDPゴシック" w:eastAsia="BIZ UDPゴシック" w:cs="BIZ UDPゴシック"/>
           <w:b w:val="0"/>
           <w:color w:val="4A4440"/>
           <w:sz w:val="12"/>
@@ -171,7 +171,7 @@
       </w:pPr>
       <w:r>
         <w:rPr>
-          <w:rFonts w:ascii="BIZ UDゴシック" w:hAnsi="BIZ UDゴシック" w:eastAsia="BIZ UDゴシック" w:cs="BIZ UDゴシック"/>
+          <w:rFonts w:ascii="BIZ UDPゴシック" w:hAnsi="BIZ UDPゴシック" w:eastAsia="BIZ UDPゴシック" w:cs="BIZ UDPゴシック"/>
           <w:b/>
           <w:color w:val="2F5B54"/>
           <w:sz w:val="34"/>
@@ -215,7 +215,7 @@
             </w:pPr>
             <w:r>
               <w:rPr>
-                <w:rFonts w:ascii="BIZ UDゴシック" w:hAnsi="BIZ UDゴシック" w:eastAsia="BIZ UDゴシック" w:cs="BIZ UDゴシック"/>
+                <w:rFonts w:ascii="BIZ UDPゴシック" w:hAnsi="BIZ UDPゴシック" w:eastAsia="BIZ UDPゴシック" w:cs="BIZ UDPゴシック"/>
                 <w:b/>
                 <w:color w:val="2F5B54"/>
                 <w:sz w:val="21"/>
@@ -229,7 +229,7 @@
             </w:pPr>
             <w:r>
               <w:rPr>
-                <w:rFonts w:ascii="BIZ UDゴシック" w:hAnsi="BIZ UDゴシック" w:eastAsia="BIZ UDゴシック" w:cs="BIZ UDゴシック"/>
+                <w:rFonts w:ascii="BIZ UDPゴシック" w:hAnsi="BIZ UDPゴシック" w:eastAsia="BIZ UDPゴシック" w:cs="BIZ UDPゴシック"/>
                 <w:b/>
                 <w:color w:val="8C6A3E"/>
                 <w:sz w:val="21"/>
@@ -238,7 +238,7 @@
             </w:r>
             <w:r>
               <w:rPr>
-                <w:rFonts w:ascii="BIZ UDゴシック" w:hAnsi="BIZ UDゴシック" w:eastAsia="BIZ UDゴシック" w:cs="BIZ UDゴシック"/>
+                <w:rFonts w:ascii="BIZ UDPゴシック" w:hAnsi="BIZ UDPゴシック" w:eastAsia="BIZ UDPゴシック" w:cs="BIZ UDPゴシック"/>
                 <w:b/>
                 <w:color w:val="2F5B54"/>
                 <w:sz w:val="21"/>
@@ -252,7 +252,7 @@
             </w:pPr>
             <w:r>
               <w:rPr>
-                <w:rFonts w:ascii="BIZ UDゴシック" w:hAnsi="BIZ UDゴシック" w:eastAsia="BIZ UDゴシック" w:cs="BIZ UDゴシック"/>
+                <w:rFonts w:ascii="BIZ UDPゴシック" w:hAnsi="BIZ UDPゴシック" w:eastAsia="BIZ UDPゴシック" w:cs="BIZ UDPゴシック"/>
                 <w:b/>
                 <w:color w:val="8C6A3E"/>
                 <w:sz w:val="21"/>
@@ -261,7 +261,7 @@
             </w:r>
             <w:r>
               <w:rPr>
-                <w:rFonts w:ascii="BIZ UDゴシック" w:hAnsi="BIZ UDゴシック" w:eastAsia="BIZ UDゴシック" w:cs="BIZ UDゴシック"/>
+                <w:rFonts w:ascii="BIZ UDPゴシック" w:hAnsi="BIZ UDPゴシック" w:eastAsia="BIZ UDPゴシック" w:cs="BIZ UDPゴシック"/>
                 <w:b/>
                 <w:color w:val="2F5B54"/>
                 <w:sz w:val="21"/>
@@ -278,7 +278,7 @@
       </w:pPr>
       <w:r>
         <w:rPr>
-          <w:rFonts w:ascii="BIZ UDゴシック" w:hAnsi="BIZ UDゴシック" w:eastAsia="BIZ UDゴシック" w:cs="BIZ UDゴシック"/>
+          <w:rFonts w:ascii="BIZ UDPゴシック" w:hAnsi="BIZ UDPゴシック" w:eastAsia="BIZ UDPゴシック" w:cs="BIZ UDPゴシック"/>
           <w:b w:val="0"/>
           <w:color w:val="4A4440"/>
           <w:sz w:val="12"/>
@@ -292,7 +292,7 @@
       </w:pPr>
       <w:r>
         <w:rPr>
-          <w:rFonts w:ascii="BIZ UDゴシック" w:hAnsi="BIZ UDゴシック" w:eastAsia="BIZ UDゴシック" w:cs="BIZ UDゴシック"/>
+          <w:rFonts w:ascii="BIZ UDPゴシック" w:hAnsi="BIZ UDPゴシック" w:eastAsia="BIZ UDPゴシック" w:cs="BIZ UDPゴシック"/>
           <w:b w:val="0"/>
           <w:color w:val="4A4440"/>
           <w:sz w:val="21"/>
@@ -301,7 +301,7 @@
       </w:r>
       <w:r>
         <w:rPr>
-          <w:rFonts w:ascii="BIZ UDゴシック" w:hAnsi="BIZ UDゴシック" w:eastAsia="BIZ UDゴシック" w:cs="BIZ UDゴシック"/>
+          <w:rFonts w:ascii="BIZ UDPゴシック" w:hAnsi="BIZ UDPゴシック" w:eastAsia="BIZ UDPゴシック" w:cs="BIZ UDPゴシック"/>
           <w:b/>
           <w:color w:val="8C6A3E"/>
           <w:sz w:val="21"/>
@@ -310,7 +310,7 @@
       </w:r>
       <w:r>
         <w:rPr>
-          <w:rFonts w:ascii="BIZ UDゴシック" w:hAnsi="BIZ UDゴシック" w:eastAsia="BIZ UDゴシック" w:cs="BIZ UDゴシック"/>
+          <w:rFonts w:ascii="BIZ UDPゴシック" w:hAnsi="BIZ UDPゴシック" w:eastAsia="BIZ UDPゴシック" w:cs="BIZ UDPゴシック"/>
           <w:b w:val="0"/>
           <w:color w:val="4A4440"/>
           <w:sz w:val="21"/>
@@ -367,7 +367,7 @@
       </w:pPr>
       <w:r>
         <w:rPr>
-          <w:rFonts w:ascii="BIZ UDゴシック" w:hAnsi="BIZ UDゴシック" w:eastAsia="BIZ UDゴシック" w:cs="BIZ UDゴシック"/>
+          <w:rFonts w:ascii="BIZ UDPゴシック" w:hAnsi="BIZ UDPゴシック" w:eastAsia="BIZ UDPゴシック" w:cs="BIZ UDPゴシック"/>
           <w:b/>
           <w:color w:val="8C6A3E"/>
           <w:sz w:val="22"/>
@@ -376,7 +376,7 @@
       </w:r>
       <w:r>
         <w:rPr>
-          <w:rFonts w:ascii="BIZ UDゴシック" w:hAnsi="BIZ UDゴシック" w:eastAsia="BIZ UDゴシック" w:cs="BIZ UDゴシック"/>
+          <w:rFonts w:ascii="BIZ UDPゴシック" w:hAnsi="BIZ UDPゴシック" w:eastAsia="BIZ UDPゴシック" w:cs="BIZ UDPゴシック"/>
           <w:b/>
           <w:color w:val="2F5B54"/>
           <w:sz w:val="24"/>
@@ -391,7 +391,7 @@
       </w:pPr>
       <w:r>
         <w:rPr>
-          <w:rFonts w:ascii="BIZ UDゴシック" w:hAnsi="BIZ UDゴシック" w:eastAsia="BIZ UDゴシック" w:cs="BIZ UDゴシック"/>
+          <w:rFonts w:ascii="BIZ UDPゴシック" w:hAnsi="BIZ UDPゴシック" w:eastAsia="BIZ UDPゴシック" w:cs="BIZ UDPゴシック"/>
           <w:b w:val="0"/>
           <w:color w:val="4A4440"/>
           <w:sz w:val="21"/>
@@ -400,7 +400,7 @@
       </w:r>
       <w:r>
         <w:rPr>
-          <w:rFonts w:ascii="BIZ UDゴシック" w:hAnsi="BIZ UDゴシック" w:eastAsia="BIZ UDゴシック" w:cs="BIZ UDゴシック"/>
+          <w:rFonts w:ascii="BIZ UDPゴシック" w:hAnsi="BIZ UDPゴシック" w:eastAsia="BIZ UDPゴシック" w:cs="BIZ UDPゴシック"/>
           <w:b/>
           <w:color w:val="8C6A3E"/>
           <w:sz w:val="21"/>
@@ -409,7 +409,7 @@
       </w:r>
       <w:r>
         <w:rPr>
-          <w:rFonts w:ascii="BIZ UDゴシック" w:hAnsi="BIZ UDゴシック" w:eastAsia="BIZ UDゴシック" w:cs="BIZ UDゴシック"/>
+          <w:rFonts w:ascii="BIZ UDPゴシック" w:hAnsi="BIZ UDPゴシック" w:eastAsia="BIZ UDPゴシック" w:cs="BIZ UDPゴシック"/>
           <w:b w:val="0"/>
           <w:color w:val="4A4440"/>
           <w:sz w:val="21"/>
@@ -418,7 +418,7 @@
       </w:r>
       <w:r>
         <w:rPr>
-          <w:rFonts w:ascii="BIZ UDゴシック" w:hAnsi="BIZ UDゴシック" w:eastAsia="BIZ UDゴシック" w:cs="BIZ UDゴシック"/>
+          <w:rFonts w:ascii="BIZ UDPゴシック" w:hAnsi="BIZ UDPゴシック" w:eastAsia="BIZ UDPゴシック" w:cs="BIZ UDPゴシック"/>
           <w:b/>
           <w:color w:val="8C6A3E"/>
           <w:sz w:val="21"/>
@@ -427,7 +427,7 @@
       </w:r>
       <w:r>
         <w:rPr>
-          <w:rFonts w:ascii="BIZ UDゴシック" w:hAnsi="BIZ UDゴシック" w:eastAsia="BIZ UDゴシック" w:cs="BIZ UDゴシック"/>
+          <w:rFonts w:ascii="BIZ UDPゴシック" w:hAnsi="BIZ UDPゴシック" w:eastAsia="BIZ UDPゴシック" w:cs="BIZ UDPゴシック"/>
           <w:b w:val="0"/>
           <w:color w:val="4A4440"/>
           <w:sz w:val="21"/>
@@ -442,7 +442,7 @@
       </w:pPr>
       <w:r>
         <w:rPr>
-          <w:rFonts w:ascii="BIZ UDゴシック" w:hAnsi="BIZ UDゴシック" w:eastAsia="BIZ UDゴシック" w:cs="BIZ UDゴシック"/>
+          <w:rFonts w:ascii="BIZ UDPゴシック" w:hAnsi="BIZ UDPゴシック" w:eastAsia="BIZ UDPゴシック" w:cs="BIZ UDPゴシック"/>
           <w:b w:val="0"/>
           <w:color w:val="4A4440"/>
           <w:sz w:val="21"/>
@@ -451,7 +451,7 @@
       </w:r>
       <w:r>
         <w:rPr>
-          <w:rFonts w:ascii="BIZ UDゴシック" w:hAnsi="BIZ UDゴシック" w:eastAsia="BIZ UDゴシック" w:cs="BIZ UDゴシック"/>
+          <w:rFonts w:ascii="BIZ UDPゴシック" w:hAnsi="BIZ UDPゴシック" w:eastAsia="BIZ UDPゴシック" w:cs="BIZ UDPゴシック"/>
           <w:b/>
           <w:color w:val="8C6A3E"/>
           <w:sz w:val="21"/>
@@ -460,7 +460,7 @@
       </w:r>
       <w:r>
         <w:rPr>
-          <w:rFonts w:ascii="BIZ UDゴシック" w:hAnsi="BIZ UDゴシック" w:eastAsia="BIZ UDゴシック" w:cs="BIZ UDゴシック"/>
+          <w:rFonts w:ascii="BIZ UDPゴシック" w:hAnsi="BIZ UDPゴシック" w:eastAsia="BIZ UDPゴシック" w:cs="BIZ UDPゴシック"/>
           <w:b w:val="0"/>
           <w:color w:val="4A4440"/>
           <w:sz w:val="21"/>
@@ -469,7 +469,7 @@
       </w:r>
       <w:r>
         <w:rPr>
-          <w:rFonts w:ascii="BIZ UDゴシック" w:hAnsi="BIZ UDゴシック" w:eastAsia="BIZ UDゴシック" w:cs="BIZ UDゴシック"/>
+          <w:rFonts w:ascii="BIZ UDPゴシック" w:hAnsi="BIZ UDPゴシック" w:eastAsia="BIZ UDPゴシック" w:cs="BIZ UDPゴシック"/>
           <w:b/>
           <w:color w:val="8C6A3E"/>
           <w:sz w:val="21"/>
@@ -478,7 +478,7 @@
       </w:r>
       <w:r>
         <w:rPr>
-          <w:rFonts w:ascii="BIZ UDゴシック" w:hAnsi="BIZ UDゴシック" w:eastAsia="BIZ UDゴシック" w:cs="BIZ UDゴシック"/>
+          <w:rFonts w:ascii="BIZ UDPゴシック" w:hAnsi="BIZ UDPゴシック" w:eastAsia="BIZ UDPゴシック" w:cs="BIZ UDPゴシック"/>
           <w:b w:val="0"/>
           <w:color w:val="4A4440"/>
           <w:sz w:val="21"/>
@@ -493,7 +493,7 @@
       </w:pPr>
       <w:r>
         <w:rPr>
-          <w:rFonts w:ascii="BIZ UDゴシック" w:hAnsi="BIZ UDゴシック" w:eastAsia="BIZ UDゴシック" w:cs="BIZ UDゴシック"/>
+          <w:rFonts w:ascii="BIZ UDPゴシック" w:hAnsi="BIZ UDPゴシック" w:eastAsia="BIZ UDPゴシック" w:cs="BIZ UDPゴシック"/>
           <w:b w:val="0"/>
           <w:color w:val="4A4440"/>
           <w:sz w:val="21"/>
@@ -502,7 +502,7 @@
       </w:r>
       <w:r>
         <w:rPr>
-          <w:rFonts w:ascii="BIZ UDゴシック" w:hAnsi="BIZ UDゴシック" w:eastAsia="BIZ UDゴシック" w:cs="BIZ UDゴシック"/>
+          <w:rFonts w:ascii="BIZ UDPゴシック" w:hAnsi="BIZ UDPゴシック" w:eastAsia="BIZ UDPゴシック" w:cs="BIZ UDPゴシック"/>
           <w:b/>
           <w:color w:val="8C6A3E"/>
           <w:sz w:val="21"/>
@@ -511,7 +511,7 @@
       </w:r>
       <w:r>
         <w:rPr>
-          <w:rFonts w:ascii="BIZ UDゴシック" w:hAnsi="BIZ UDゴシック" w:eastAsia="BIZ UDゴシック" w:cs="BIZ UDゴシック"/>
+          <w:rFonts w:ascii="BIZ UDPゴシック" w:hAnsi="BIZ UDPゴシック" w:eastAsia="BIZ UDPゴシック" w:cs="BIZ UDPゴシック"/>
           <w:b w:val="0"/>
           <w:color w:val="4A4440"/>
           <w:sz w:val="21"/>
@@ -520,7 +520,7 @@
       </w:r>
       <w:r>
         <w:rPr>
-          <w:rFonts w:ascii="BIZ UDゴシック" w:hAnsi="BIZ UDゴシック" w:eastAsia="BIZ UDゴシック" w:cs="BIZ UDゴシック"/>
+          <w:rFonts w:ascii="BIZ UDPゴシック" w:hAnsi="BIZ UDPゴシック" w:eastAsia="BIZ UDPゴシック" w:cs="BIZ UDPゴシック"/>
           <w:b/>
           <w:color w:val="8C6A3E"/>
           <w:sz w:val="21"/>
@@ -529,7 +529,7 @@
       </w:r>
       <w:r>
         <w:rPr>
-          <w:rFonts w:ascii="BIZ UDゴシック" w:hAnsi="BIZ UDゴシック" w:eastAsia="BIZ UDゴシック" w:cs="BIZ UDゴシック"/>
+          <w:rFonts w:ascii="BIZ UDPゴシック" w:hAnsi="BIZ UDPゴシック" w:eastAsia="BIZ UDPゴシック" w:cs="BIZ UDPゴシック"/>
           <w:b w:val="0"/>
           <w:color w:val="4A4440"/>
           <w:sz w:val="21"/>
@@ -544,7 +544,7 @@
       </w:pPr>
       <w:r>
         <w:rPr>
-          <w:rFonts w:ascii="BIZ UDゴシック" w:hAnsi="BIZ UDゴシック" w:eastAsia="BIZ UDゴシック" w:cs="BIZ UDゴシック"/>
+          <w:rFonts w:ascii="BIZ UDPゴシック" w:hAnsi="BIZ UDPゴシック" w:eastAsia="BIZ UDPゴシック" w:cs="BIZ UDPゴシック"/>
           <w:b w:val="0"/>
           <w:color w:val="4A4440"/>
           <w:sz w:val="21"/>
@@ -553,7 +553,7 @@
       </w:r>
       <w:r>
         <w:rPr>
-          <w:rFonts w:ascii="BIZ UDゴシック" w:hAnsi="BIZ UDゴシック" w:eastAsia="BIZ UDゴシック" w:cs="BIZ UDゴシック"/>
+          <w:rFonts w:ascii="BIZ UDPゴシック" w:hAnsi="BIZ UDPゴシック" w:eastAsia="BIZ UDPゴシック" w:cs="BIZ UDPゴシック"/>
           <w:b/>
           <w:color w:val="8C6A3E"/>
           <w:sz w:val="21"/>
@@ -562,7 +562,7 @@
       </w:r>
       <w:r>
         <w:rPr>
-          <w:rFonts w:ascii="BIZ UDゴシック" w:hAnsi="BIZ UDゴシック" w:eastAsia="BIZ UDゴシック" w:cs="BIZ UDゴシック"/>
+          <w:rFonts w:ascii="BIZ UDPゴシック" w:hAnsi="BIZ UDPゴシック" w:eastAsia="BIZ UDPゴシック" w:cs="BIZ UDPゴシック"/>
           <w:b w:val="0"/>
           <w:color w:val="4A4440"/>
           <w:sz w:val="21"/>
@@ -571,7 +571,7 @@
       </w:r>
       <w:r>
         <w:rPr>
-          <w:rFonts w:ascii="BIZ UDゴシック" w:hAnsi="BIZ UDゴシック" w:eastAsia="BIZ UDゴシック" w:cs="BIZ UDゴシック"/>
+          <w:rFonts w:ascii="BIZ UDPゴシック" w:hAnsi="BIZ UDPゴシック" w:eastAsia="BIZ UDPゴシック" w:cs="BIZ UDPゴシック"/>
           <w:b/>
           <w:color w:val="8C6A3E"/>
           <w:sz w:val="21"/>
@@ -580,7 +580,7 @@
       </w:r>
       <w:r>
         <w:rPr>
-          <w:rFonts w:ascii="BIZ UDゴシック" w:hAnsi="BIZ UDゴシック" w:eastAsia="BIZ UDゴシック" w:cs="BIZ UDゴシック"/>
+          <w:rFonts w:ascii="BIZ UDPゴシック" w:hAnsi="BIZ UDPゴシック" w:eastAsia="BIZ UDPゴシック" w:cs="BIZ UDPゴシック"/>
           <w:b w:val="0"/>
           <w:color w:val="4A4440"/>
           <w:sz w:val="21"/>
@@ -589,7 +589,7 @@
       </w:r>
       <w:r>
         <w:rPr>
-          <w:rFonts w:ascii="BIZ UDゴシック" w:hAnsi="BIZ UDゴシック" w:eastAsia="BIZ UDゴシック" w:cs="BIZ UDゴシック"/>
+          <w:rFonts w:ascii="BIZ UDPゴシック" w:hAnsi="BIZ UDPゴシック" w:eastAsia="BIZ UDPゴシック" w:cs="BIZ UDPゴシック"/>
           <w:b/>
           <w:color w:val="8C6A3E"/>
           <w:sz w:val="21"/>
@@ -598,7 +598,7 @@
       </w:r>
       <w:r>
         <w:rPr>
-          <w:rFonts w:ascii="BIZ UDゴシック" w:hAnsi="BIZ UDゴシック" w:eastAsia="BIZ UDゴシック" w:cs="BIZ UDゴシック"/>
+          <w:rFonts w:ascii="BIZ UDPゴシック" w:hAnsi="BIZ UDPゴシック" w:eastAsia="BIZ UDPゴシック" w:cs="BIZ UDPゴシック"/>
           <w:b w:val="0"/>
           <w:color w:val="4A4440"/>
           <w:sz w:val="21"/>
@@ -613,7 +613,7 @@
       </w:pPr>
       <w:r>
         <w:rPr>
-          <w:rFonts w:ascii="BIZ UDゴシック" w:hAnsi="BIZ UDゴシック" w:eastAsia="BIZ UDゴシック" w:cs="BIZ UDゴシック"/>
+          <w:rFonts w:ascii="BIZ UDPゴシック" w:hAnsi="BIZ UDPゴシック" w:eastAsia="BIZ UDPゴシック" w:cs="BIZ UDPゴシック"/>
           <w:b/>
           <w:color w:val="8C6A3E"/>
           <w:sz w:val="21"/>
@@ -622,7 +622,7 @@
       </w:r>
       <w:r>
         <w:rPr>
-          <w:rFonts w:ascii="BIZ UDゴシック" w:hAnsi="BIZ UDゴシック" w:eastAsia="BIZ UDゴシック" w:cs="BIZ UDゴシック"/>
+          <w:rFonts w:ascii="BIZ UDPゴシック" w:hAnsi="BIZ UDPゴシック" w:eastAsia="BIZ UDPゴシック" w:cs="BIZ UDPゴシック"/>
           <w:b w:val="0"/>
           <w:color w:val="4A4440"/>
           <w:sz w:val="21"/>
@@ -631,7 +631,7 @@
       </w:r>
       <w:r>
         <w:rPr>
-          <w:rFonts w:ascii="BIZ UDゴシック" w:hAnsi="BIZ UDゴシック" w:eastAsia="BIZ UDゴシック" w:cs="BIZ UDゴシック"/>
+          <w:rFonts w:ascii="BIZ UDPゴシック" w:hAnsi="BIZ UDPゴシック" w:eastAsia="BIZ UDPゴシック" w:cs="BIZ UDPゴシック"/>
           <w:b/>
           <w:color w:val="8C6A3E"/>
           <w:sz w:val="21"/>
@@ -648,7 +648,7 @@
       </w:pPr>
       <w:r>
         <w:rPr>
-          <w:rFonts w:ascii="BIZ UDゴシック" w:hAnsi="BIZ UDゴシック" w:eastAsia="BIZ UDゴシック" w:cs="BIZ UDゴシック"/>
+          <w:rFonts w:ascii="BIZ UDPゴシック" w:hAnsi="BIZ UDPゴシック" w:eastAsia="BIZ UDPゴシック" w:cs="BIZ UDPゴシック"/>
           <w:b/>
           <w:color w:val="8C6A3E"/>
           <w:sz w:val="22"/>
@@ -657,7 +657,7 @@
       </w:r>
       <w:r>
         <w:rPr>
-          <w:rFonts w:ascii="BIZ UDゴシック" w:hAnsi="BIZ UDゴシック" w:eastAsia="BIZ UDゴシック" w:cs="BIZ UDゴシック"/>
+          <w:rFonts w:ascii="BIZ UDPゴシック" w:hAnsi="BIZ UDPゴシック" w:eastAsia="BIZ UDPゴシック" w:cs="BIZ UDPゴシック"/>
           <w:b/>
           <w:color w:val="2F5B54"/>
           <w:sz w:val="24"/>
@@ -672,7 +672,7 @@
       </w:pPr>
       <w:r>
         <w:rPr>
-          <w:rFonts w:ascii="BIZ UDゴシック" w:hAnsi="BIZ UDゴシック" w:eastAsia="BIZ UDゴシック" w:cs="BIZ UDゴシック"/>
+          <w:rFonts w:ascii="BIZ UDPゴシック" w:hAnsi="BIZ UDPゴシック" w:eastAsia="BIZ UDPゴシック" w:cs="BIZ UDPゴシック"/>
           <w:b w:val="0"/>
           <w:color w:val="4A4440"/>
           <w:sz w:val="21"/>
@@ -681,7 +681,7 @@
       </w:r>
       <w:r>
         <w:rPr>
-          <w:rFonts w:ascii="BIZ UDゴシック" w:hAnsi="BIZ UDゴシック" w:eastAsia="BIZ UDゴシック" w:cs="BIZ UDゴシック"/>
+          <w:rFonts w:ascii="BIZ UDPゴシック" w:hAnsi="BIZ UDPゴシック" w:eastAsia="BIZ UDPゴシック" w:cs="BIZ UDPゴシック"/>
           <w:b/>
           <w:color w:val="8C6A3E"/>
           <w:sz w:val="21"/>
@@ -690,7 +690,7 @@
       </w:r>
       <w:r>
         <w:rPr>
-          <w:rFonts w:ascii="BIZ UDゴシック" w:hAnsi="BIZ UDゴシック" w:eastAsia="BIZ UDゴシック" w:cs="BIZ UDゴシック"/>
+          <w:rFonts w:ascii="BIZ UDPゴシック" w:hAnsi="BIZ UDPゴシック" w:eastAsia="BIZ UDPゴシック" w:cs="BIZ UDPゴシック"/>
           <w:b w:val="0"/>
           <w:color w:val="4A4440"/>
           <w:sz w:val="21"/>
@@ -705,7 +705,7 @@
       </w:pPr>
       <w:r>
         <w:rPr>
-          <w:rFonts w:ascii="BIZ UDゴシック" w:hAnsi="BIZ UDゴシック" w:eastAsia="BIZ UDゴシック" w:cs="BIZ UDゴシック"/>
+          <w:rFonts w:ascii="BIZ UDPゴシック" w:hAnsi="BIZ UDPゴシック" w:eastAsia="BIZ UDPゴシック" w:cs="BIZ UDPゴシック"/>
           <w:b w:val="0"/>
           <w:color w:val="4A4440"/>
           <w:sz w:val="21"/>
@@ -714,7 +714,7 @@
       </w:r>
       <w:r>
         <w:rPr>
-          <w:rFonts w:ascii="BIZ UDゴシック" w:hAnsi="BIZ UDゴシック" w:eastAsia="BIZ UDゴシック" w:cs="BIZ UDゴシック"/>
+          <w:rFonts w:ascii="BIZ UDPゴシック" w:hAnsi="BIZ UDPゴシック" w:eastAsia="BIZ UDPゴシック" w:cs="BIZ UDPゴシック"/>
           <w:b/>
           <w:color w:val="8C6A3E"/>
           <w:sz w:val="21"/>
@@ -723,7 +723,7 @@
       </w:r>
       <w:r>
         <w:rPr>
-          <w:rFonts w:ascii="BIZ UDゴシック" w:hAnsi="BIZ UDゴシック" w:eastAsia="BIZ UDゴシック" w:cs="BIZ UDゴシック"/>
+          <w:rFonts w:ascii="BIZ UDPゴシック" w:hAnsi="BIZ UDPゴシック" w:eastAsia="BIZ UDPゴシック" w:cs="BIZ UDPゴシック"/>
           <w:b w:val="0"/>
           <w:color w:val="4A4440"/>
           <w:sz w:val="21"/>
@@ -732,7 +732,7 @@
       </w:r>
       <w:r>
         <w:rPr>
-          <w:rFonts w:ascii="BIZ UDゴシック" w:hAnsi="BIZ UDゴシック" w:eastAsia="BIZ UDゴシック" w:cs="BIZ UDゴシック"/>
+          <w:rFonts w:ascii="BIZ UDPゴシック" w:hAnsi="BIZ UDPゴシック" w:eastAsia="BIZ UDPゴシック" w:cs="BIZ UDPゴシック"/>
           <w:b/>
           <w:color w:val="8C6A3E"/>
           <w:sz w:val="21"/>
@@ -741,7 +741,7 @@
       </w:r>
       <w:r>
         <w:rPr>
-          <w:rFonts w:ascii="BIZ UDゴシック" w:hAnsi="BIZ UDゴシック" w:eastAsia="BIZ UDゴシック" w:cs="BIZ UDゴシック"/>
+          <w:rFonts w:ascii="BIZ UDPゴシック" w:hAnsi="BIZ UDPゴシック" w:eastAsia="BIZ UDPゴシック" w:cs="BIZ UDPゴシック"/>
           <w:b w:val="0"/>
           <w:color w:val="4A4440"/>
           <w:sz w:val="21"/>
@@ -756,7 +756,7 @@
       </w:pPr>
       <w:r>
         <w:rPr>
-          <w:rFonts w:ascii="BIZ UDゴシック" w:hAnsi="BIZ UDゴシック" w:eastAsia="BIZ UDゴシック" w:cs="BIZ UDゴシック"/>
+          <w:rFonts w:ascii="BIZ UDPゴシック" w:hAnsi="BIZ UDPゴシック" w:eastAsia="BIZ UDPゴシック" w:cs="BIZ UDPゴシック"/>
           <w:b w:val="0"/>
           <w:color w:val="4A4440"/>
           <w:sz w:val="21"/>
@@ -765,7 +765,7 @@
       </w:r>
       <w:r>
         <w:rPr>
-          <w:rFonts w:ascii="BIZ UDゴシック" w:hAnsi="BIZ UDゴシック" w:eastAsia="BIZ UDゴシック" w:cs="BIZ UDゴシック"/>
+          <w:rFonts w:ascii="BIZ UDPゴシック" w:hAnsi="BIZ UDPゴシック" w:eastAsia="BIZ UDPゴシック" w:cs="BIZ UDPゴシック"/>
           <w:b/>
           <w:color w:val="8C6A3E"/>
           <w:sz w:val="21"/>
@@ -774,7 +774,7 @@
       </w:r>
       <w:r>
         <w:rPr>
-          <w:rFonts w:ascii="BIZ UDゴシック" w:hAnsi="BIZ UDゴシック" w:eastAsia="BIZ UDゴシック" w:cs="BIZ UDゴシック"/>
+          <w:rFonts w:ascii="BIZ UDPゴシック" w:hAnsi="BIZ UDPゴシック" w:eastAsia="BIZ UDPゴシック" w:cs="BIZ UDPゴシック"/>
           <w:b w:val="0"/>
           <w:color w:val="4A4440"/>
           <w:sz w:val="21"/>
@@ -783,7 +783,7 @@
       </w:r>
       <w:r>
         <w:rPr>
-          <w:rFonts w:ascii="BIZ UDゴシック" w:hAnsi="BIZ UDゴシック" w:eastAsia="BIZ UDゴシック" w:cs="BIZ UDゴシック"/>
+          <w:rFonts w:ascii="BIZ UDPゴシック" w:hAnsi="BIZ UDPゴシック" w:eastAsia="BIZ UDPゴシック" w:cs="BIZ UDPゴシック"/>
           <w:b/>
           <w:color w:val="8C6A3E"/>
           <w:sz w:val="21"/>
@@ -792,7 +792,7 @@
       </w:r>
       <w:r>
         <w:rPr>
-          <w:rFonts w:ascii="BIZ UDゴシック" w:hAnsi="BIZ UDゴシック" w:eastAsia="BIZ UDゴシック" w:cs="BIZ UDゴシック"/>
+          <w:rFonts w:ascii="BIZ UDPゴシック" w:hAnsi="BIZ UDPゴシック" w:eastAsia="BIZ UDPゴシック" w:cs="BIZ UDPゴシック"/>
           <w:b w:val="0"/>
           <w:color w:val="4A4440"/>
           <w:sz w:val="21"/>
@@ -801,7 +801,7 @@
       </w:r>
       <w:r>
         <w:rPr>
-          <w:rFonts w:ascii="BIZ UDゴシック" w:hAnsi="BIZ UDゴシック" w:eastAsia="BIZ UDゴシック" w:cs="BIZ UDゴシック"/>
+          <w:rFonts w:ascii="BIZ UDPゴシック" w:hAnsi="BIZ UDPゴシック" w:eastAsia="BIZ UDPゴシック" w:cs="BIZ UDPゴシック"/>
           <w:b/>
           <w:color w:val="8C6A3E"/>
           <w:sz w:val="21"/>
@@ -816,7 +816,7 @@
       </w:pPr>
       <w:r>
         <w:rPr>
-          <w:rFonts w:ascii="BIZ UDゴシック" w:hAnsi="BIZ UDゴシック" w:eastAsia="BIZ UDゴシック" w:cs="BIZ UDゴシック"/>
+          <w:rFonts w:ascii="BIZ UDPゴシック" w:hAnsi="BIZ UDPゴシック" w:eastAsia="BIZ UDPゴシック" w:cs="BIZ UDPゴシック"/>
           <w:b w:val="0"/>
           <w:color w:val="4A4440"/>
           <w:sz w:val="21"/>
@@ -825,7 +825,7 @@
       </w:r>
       <w:r>
         <w:rPr>
-          <w:rFonts w:ascii="BIZ UDゴシック" w:hAnsi="BIZ UDゴシック" w:eastAsia="BIZ UDゴシック" w:cs="BIZ UDゴシック"/>
+          <w:rFonts w:ascii="BIZ UDPゴシック" w:hAnsi="BIZ UDPゴシック" w:eastAsia="BIZ UDPゴシック" w:cs="BIZ UDPゴシック"/>
           <w:b/>
           <w:color w:val="8C6A3E"/>
           <w:sz w:val="21"/>
@@ -834,7 +834,7 @@
       </w:r>
       <w:r>
         <w:rPr>
-          <w:rFonts w:ascii="BIZ UDゴシック" w:hAnsi="BIZ UDゴシック" w:eastAsia="BIZ UDゴシック" w:cs="BIZ UDゴシック"/>
+          <w:rFonts w:ascii="BIZ UDPゴシック" w:hAnsi="BIZ UDPゴシック" w:eastAsia="BIZ UDPゴシック" w:cs="BIZ UDPゴシック"/>
           <w:b w:val="0"/>
           <w:color w:val="4A4440"/>
           <w:sz w:val="21"/>
@@ -843,7 +843,7 @@
       </w:r>
       <w:r>
         <w:rPr>
-          <w:rFonts w:ascii="BIZ UDゴシック" w:hAnsi="BIZ UDゴシック" w:eastAsia="BIZ UDゴシック" w:cs="BIZ UDゴシック"/>
+          <w:rFonts w:ascii="BIZ UDPゴシック" w:hAnsi="BIZ UDPゴシック" w:eastAsia="BIZ UDPゴシック" w:cs="BIZ UDPゴシック"/>
           <w:b/>
           <w:color w:val="8C6A3E"/>
           <w:sz w:val="21"/>
@@ -852,7 +852,7 @@
       </w:r>
       <w:r>
         <w:rPr>
-          <w:rFonts w:ascii="BIZ UDゴシック" w:hAnsi="BIZ UDゴシック" w:eastAsia="BIZ UDゴシック" w:cs="BIZ UDゴシック"/>
+          <w:rFonts w:ascii="BIZ UDPゴシック" w:hAnsi="BIZ UDPゴシック" w:eastAsia="BIZ UDPゴシック" w:cs="BIZ UDPゴシック"/>
           <w:b w:val="0"/>
           <w:color w:val="4A4440"/>
           <w:sz w:val="21"/>
@@ -899,7 +899,7 @@
             </w:pPr>
             <w:r>
               <w:rPr>
-                <w:rFonts w:ascii="BIZ UDゴシック" w:hAnsi="BIZ UDゴシック" w:eastAsia="BIZ UDゴシック" w:cs="BIZ UDゴシック"/>
+                <w:rFonts w:ascii="BIZ UDPゴシック" w:hAnsi="BIZ UDPゴシック" w:eastAsia="BIZ UDPゴシック" w:cs="BIZ UDPゴシック"/>
                 <w:b/>
                 <w:color w:val="8C6A3E"/>
                 <w:sz w:val="21"/>
@@ -908,7 +908,7 @@
             </w:r>
             <w:r>
               <w:rPr>
-                <w:rFonts w:ascii="BIZ UDゴシック" w:hAnsi="BIZ UDゴシック" w:eastAsia="BIZ UDゴシック" w:cs="BIZ UDゴシック"/>
+                <w:rFonts w:ascii="BIZ UDPゴシック" w:hAnsi="BIZ UDPゴシック" w:eastAsia="BIZ UDPゴシック" w:cs="BIZ UDPゴシック"/>
                 <w:b/>
                 <w:color w:val="2F5B54"/>
                 <w:sz w:val="22"/>
@@ -923,7 +923,7 @@
             </w:pPr>
             <w:r>
               <w:rPr>
-                <w:rFonts w:ascii="BIZ UDゴシック" w:hAnsi="BIZ UDゴシック" w:eastAsia="BIZ UDゴシック" w:cs="BIZ UDゴシック"/>
+                <w:rFonts w:ascii="BIZ UDPゴシック" w:hAnsi="BIZ UDPゴシック" w:eastAsia="BIZ UDPゴシック" w:cs="BIZ UDPゴシック"/>
                 <w:b w:val="0"/>
                 <w:color w:val="4A4440"/>
                 <w:sz w:val="20"/>
@@ -932,7 +932,7 @@
             </w:r>
             <w:r>
               <w:rPr>
-                <w:rFonts w:ascii="BIZ UDゴシック" w:hAnsi="BIZ UDゴシック" w:eastAsia="BIZ UDゴシック" w:cs="BIZ UDゴシック"/>
+                <w:rFonts w:ascii="BIZ UDPゴシック" w:hAnsi="BIZ UDPゴシック" w:eastAsia="BIZ UDPゴシック" w:cs="BIZ UDPゴシック"/>
                 <w:b/>
                 <w:color w:val="8C6A3E"/>
                 <w:sz w:val="20"/>
@@ -941,7 +941,7 @@
             </w:r>
             <w:r>
               <w:rPr>
-                <w:rFonts w:ascii="BIZ UDゴシック" w:hAnsi="BIZ UDゴシック" w:eastAsia="BIZ UDゴシック" w:cs="BIZ UDゴシック"/>
+                <w:rFonts w:ascii="BIZ UDPゴシック" w:hAnsi="BIZ UDPゴシック" w:eastAsia="BIZ UDPゴシック" w:cs="BIZ UDPゴシック"/>
                 <w:b w:val="0"/>
                 <w:color w:val="4A4440"/>
                 <w:sz w:val="20"/>
@@ -950,7 +950,7 @@
             </w:r>
             <w:r>
               <w:rPr>
-                <w:rFonts w:ascii="BIZ UDゴシック" w:hAnsi="BIZ UDゴシック" w:eastAsia="BIZ UDゴシック" w:cs="BIZ UDゴシック"/>
+                <w:rFonts w:ascii="BIZ UDPゴシック" w:hAnsi="BIZ UDPゴシック" w:eastAsia="BIZ UDPゴシック" w:cs="BIZ UDPゴシック"/>
                 <w:b/>
                 <w:color w:val="8C6A3E"/>
                 <w:sz w:val="20"/>
@@ -959,7 +959,7 @@
             </w:r>
             <w:r>
               <w:rPr>
-                <w:rFonts w:ascii="BIZ UDゴシック" w:hAnsi="BIZ UDゴシック" w:eastAsia="BIZ UDゴシック" w:cs="BIZ UDゴシック"/>
+                <w:rFonts w:ascii="BIZ UDPゴシック" w:hAnsi="BIZ UDPゴシック" w:eastAsia="BIZ UDPゴシック" w:cs="BIZ UDPゴシック"/>
                 <w:b w:val="0"/>
                 <w:color w:val="4A4440"/>
                 <w:sz w:val="20"/>
@@ -974,7 +974,7 @@
             </w:pPr>
             <w:r>
               <w:rPr>
-                <w:rFonts w:ascii="BIZ UDゴシック" w:hAnsi="BIZ UDゴシック" w:eastAsia="BIZ UDゴシック" w:cs="BIZ UDゴシック"/>
+                <w:rFonts w:ascii="BIZ UDPゴシック" w:hAnsi="BIZ UDPゴシック" w:eastAsia="BIZ UDPゴシック" w:cs="BIZ UDPゴシック"/>
                 <w:b w:val="0"/>
                 <w:color w:val="4A4440"/>
                 <w:sz w:val="20"/>
@@ -983,7 +983,7 @@
             </w:r>
             <w:r>
               <w:rPr>
-                <w:rFonts w:ascii="BIZ UDゴシック" w:hAnsi="BIZ UDゴシック" w:eastAsia="BIZ UDゴシック" w:cs="BIZ UDゴシック"/>
+                <w:rFonts w:ascii="BIZ UDPゴシック" w:hAnsi="BIZ UDPゴシック" w:eastAsia="BIZ UDPゴシック" w:cs="BIZ UDPゴシック"/>
                 <w:b/>
                 <w:color w:val="8C6A3E"/>
                 <w:sz w:val="20"/>
@@ -992,7 +992,7 @@
             </w:r>
             <w:r>
               <w:rPr>
-                <w:rFonts w:ascii="BIZ UDゴシック" w:hAnsi="BIZ UDゴシック" w:eastAsia="BIZ UDゴシック" w:cs="BIZ UDゴシック"/>
+                <w:rFonts w:ascii="BIZ UDPゴシック" w:hAnsi="BIZ UDPゴシック" w:eastAsia="BIZ UDPゴシック" w:cs="BIZ UDPゴシック"/>
                 <w:b w:val="0"/>
                 <w:color w:val="4A4440"/>
                 <w:sz w:val="20"/>
@@ -1007,7 +1007,7 @@
             </w:pPr>
             <w:r>
               <w:rPr>
-                <w:rFonts w:ascii="BIZ UDゴシック" w:hAnsi="BIZ UDゴシック" w:eastAsia="BIZ UDゴシック" w:cs="BIZ UDゴシック"/>
+                <w:rFonts w:ascii="BIZ UDPゴシック" w:hAnsi="BIZ UDPゴシック" w:eastAsia="BIZ UDPゴシック" w:cs="BIZ UDPゴシック"/>
                 <w:b w:val="0"/>
                 <w:color w:val="4A4440"/>
                 <w:sz w:val="20"/>
@@ -1016,7 +1016,7 @@
             </w:r>
             <w:r>
               <w:rPr>
-                <w:rFonts w:ascii="BIZ UDゴシック" w:hAnsi="BIZ UDゴシック" w:eastAsia="BIZ UDゴシック" w:cs="BIZ UDゴシック"/>
+                <w:rFonts w:ascii="BIZ UDPゴシック" w:hAnsi="BIZ UDPゴシック" w:eastAsia="BIZ UDPゴシック" w:cs="BIZ UDPゴシック"/>
                 <w:b/>
                 <w:color w:val="8C6A3E"/>
                 <w:sz w:val="20"/>
@@ -1025,7 +1025,7 @@
             </w:r>
             <w:r>
               <w:rPr>
-                <w:rFonts w:ascii="BIZ UDゴシック" w:hAnsi="BIZ UDゴシック" w:eastAsia="BIZ UDゴシック" w:cs="BIZ UDゴシック"/>
+                <w:rFonts w:ascii="BIZ UDPゴシック" w:hAnsi="BIZ UDPゴシック" w:eastAsia="BIZ UDPゴシック" w:cs="BIZ UDPゴシック"/>
                 <w:b w:val="0"/>
                 <w:color w:val="4A4440"/>
                 <w:sz w:val="20"/>
@@ -1034,7 +1034,7 @@
             </w:r>
             <w:r>
               <w:rPr>
-                <w:rFonts w:ascii="BIZ UDゴシック" w:hAnsi="BIZ UDゴシック" w:eastAsia="BIZ UDゴシック" w:cs="BIZ UDゴシック"/>
+                <w:rFonts w:ascii="BIZ UDPゴシック" w:hAnsi="BIZ UDPゴシック" w:eastAsia="BIZ UDPゴシック" w:cs="BIZ UDPゴシック"/>
                 <w:b/>
                 <w:color w:val="8C6A3E"/>
                 <w:sz w:val="20"/>
@@ -1043,7 +1043,7 @@
             </w:r>
             <w:r>
               <w:rPr>
-                <w:rFonts w:ascii="BIZ UDゴシック" w:hAnsi="BIZ UDゴシック" w:eastAsia="BIZ UDゴシック" w:cs="BIZ UDゴシック"/>
+                <w:rFonts w:ascii="BIZ UDPゴシック" w:hAnsi="BIZ UDPゴシック" w:eastAsia="BIZ UDPゴシック" w:cs="BIZ UDPゴシック"/>
                 <w:b w:val="0"/>
                 <w:color w:val="4A4440"/>
                 <w:sz w:val="20"/>
@@ -1058,7 +1058,7 @@
             </w:pPr>
             <w:r>
               <w:rPr>
-                <w:rFonts w:ascii="BIZ UDゴシック" w:hAnsi="BIZ UDゴシック" w:eastAsia="BIZ UDゴシック" w:cs="BIZ UDゴシック"/>
+                <w:rFonts w:ascii="BIZ UDPゴシック" w:hAnsi="BIZ UDPゴシック" w:eastAsia="BIZ UDPゴシック" w:cs="BIZ UDPゴシック"/>
                 <w:b w:val="0"/>
                 <w:color w:val="4A4440"/>
                 <w:sz w:val="20"/>
@@ -1067,7 +1067,7 @@
             </w:r>
             <w:r>
               <w:rPr>
-                <w:rFonts w:ascii="BIZ UDゴシック" w:hAnsi="BIZ UDゴシック" w:eastAsia="BIZ UDゴシック" w:cs="BIZ UDゴシック"/>
+                <w:rFonts w:ascii="BIZ UDPゴシック" w:hAnsi="BIZ UDPゴシック" w:eastAsia="BIZ UDPゴシック" w:cs="BIZ UDPゴシック"/>
                 <w:b/>
                 <w:color w:val="8C6A3E"/>
                 <w:sz w:val="20"/>
@@ -1076,7 +1076,7 @@
             </w:r>
             <w:r>
               <w:rPr>
-                <w:rFonts w:ascii="BIZ UDゴシック" w:hAnsi="BIZ UDゴシック" w:eastAsia="BIZ UDゴシック" w:cs="BIZ UDゴシック"/>
+                <w:rFonts w:ascii="BIZ UDPゴシック" w:hAnsi="BIZ UDPゴシック" w:eastAsia="BIZ UDPゴシック" w:cs="BIZ UDPゴシック"/>
                 <w:b w:val="0"/>
                 <w:color w:val="4A4440"/>
                 <w:sz w:val="20"/>
@@ -1085,7 +1085,7 @@
             </w:r>
             <w:r>
               <w:rPr>
-                <w:rFonts w:ascii="BIZ UDゴシック" w:hAnsi="BIZ UDゴシック" w:eastAsia="BIZ UDゴシック" w:cs="BIZ UDゴシック"/>
+                <w:rFonts w:ascii="BIZ UDPゴシック" w:hAnsi="BIZ UDPゴシック" w:eastAsia="BIZ UDPゴシック" w:cs="BIZ UDPゴシック"/>
                 <w:b/>
                 <w:color w:val="8C6A3E"/>
                 <w:sz w:val="20"/>
@@ -1094,7 +1094,7 @@
             </w:r>
             <w:r>
               <w:rPr>
-                <w:rFonts w:ascii="BIZ UDゴシック" w:hAnsi="BIZ UDゴシック" w:eastAsia="BIZ UDゴシック" w:cs="BIZ UDゴシック"/>
+                <w:rFonts w:ascii="BIZ UDPゴシック" w:hAnsi="BIZ UDPゴシック" w:eastAsia="BIZ UDPゴシック" w:cs="BIZ UDPゴシック"/>
                 <w:b w:val="0"/>
                 <w:color w:val="4A4440"/>
                 <w:sz w:val="20"/>
@@ -1109,7 +1109,7 @@
             </w:pPr>
             <w:r>
               <w:rPr>
-                <w:rFonts w:ascii="BIZ UDゴシック" w:hAnsi="BIZ UDゴシック" w:eastAsia="BIZ UDゴシック" w:cs="BIZ UDゴシック"/>
+                <w:rFonts w:ascii="BIZ UDPゴシック" w:hAnsi="BIZ UDPゴシック" w:eastAsia="BIZ UDPゴシック" w:cs="BIZ UDPゴシック"/>
                 <w:b w:val="0"/>
                 <w:color w:val="4A4440"/>
                 <w:sz w:val="20"/>
@@ -1118,7 +1118,7 @@
             </w:r>
             <w:r>
               <w:rPr>
-                <w:rFonts w:ascii="BIZ UDゴシック" w:hAnsi="BIZ UDゴシック" w:eastAsia="BIZ UDゴシック" w:cs="BIZ UDゴシック"/>
+                <w:rFonts w:ascii="BIZ UDPゴシック" w:hAnsi="BIZ UDPゴシック" w:eastAsia="BIZ UDPゴシック" w:cs="BIZ UDPゴシック"/>
                 <w:b w:val="0"/>
                 <w:color w:val="4A4440"/>
                 <w:sz w:val="20"/>
@@ -1135,7 +1135,7 @@
       </w:pPr>
       <w:r>
         <w:rPr>
-          <w:rFonts w:ascii="BIZ UDゴシック" w:hAnsi="BIZ UDゴシック" w:eastAsia="BIZ UDゴシック" w:cs="BIZ UDゴシック"/>
+          <w:rFonts w:ascii="BIZ UDPゴシック" w:hAnsi="BIZ UDPゴシック" w:eastAsia="BIZ UDPゴシック" w:cs="BIZ UDPゴシック"/>
           <w:b w:val="0"/>
           <w:color w:val="4A4440"/>
           <w:sz w:val="12"/>
@@ -1149,7 +1149,7 @@
       </w:pPr>
       <w:r>
         <w:rPr>
-          <w:rFonts w:ascii="BIZ UDゴシック" w:hAnsi="BIZ UDゴシック" w:eastAsia="BIZ UDゴシック" w:cs="BIZ UDゴシック"/>
+          <w:rFonts w:ascii="BIZ UDPゴシック" w:hAnsi="BIZ UDPゴシック" w:eastAsia="BIZ UDPゴシック" w:cs="BIZ UDPゴシック"/>
           <w:b/>
           <w:color w:val="8C6A3E"/>
           <w:sz w:val="21"/>
@@ -1158,7 +1158,7 @@
       </w:r>
       <w:r>
         <w:rPr>
-          <w:rFonts w:ascii="BIZ UDゴシック" w:hAnsi="BIZ UDゴシック" w:eastAsia="BIZ UDゴシック" w:cs="BIZ UDゴシック"/>
+          <w:rFonts w:ascii="BIZ UDPゴシック" w:hAnsi="BIZ UDPゴシック" w:eastAsia="BIZ UDPゴシック" w:cs="BIZ UDPゴシック"/>
           <w:b w:val="0"/>
           <w:color w:val="4A4440"/>
           <w:sz w:val="21"/>
@@ -1175,7 +1175,7 @@
       </w:pPr>
       <w:r>
         <w:rPr>
-          <w:rFonts w:ascii="BIZ UDゴシック" w:hAnsi="BIZ UDゴシック" w:eastAsia="BIZ UDゴシック" w:cs="BIZ UDゴシック"/>
+          <w:rFonts w:ascii="BIZ UDPゴシック" w:hAnsi="BIZ UDPゴシック" w:eastAsia="BIZ UDPゴシック" w:cs="BIZ UDPゴシック"/>
           <w:b/>
           <w:color w:val="8C6A3E"/>
           <w:sz w:val="22"/>
@@ -1184,7 +1184,7 @@
       </w:r>
       <w:r>
         <w:rPr>
-          <w:rFonts w:ascii="BIZ UDゴシック" w:hAnsi="BIZ UDゴシック" w:eastAsia="BIZ UDゴシック" w:cs="BIZ UDゴシック"/>
+          <w:rFonts w:ascii="BIZ UDPゴシック" w:hAnsi="BIZ UDPゴシック" w:eastAsia="BIZ UDPゴシック" w:cs="BIZ UDPゴシック"/>
           <w:b/>
           <w:color w:val="2F5B54"/>
           <w:sz w:val="24"/>
@@ -1199,7 +1199,7 @@
       </w:pPr>
       <w:r>
         <w:rPr>
-          <w:rFonts w:ascii="BIZ UDゴシック" w:hAnsi="BIZ UDゴシック" w:eastAsia="BIZ UDゴシック" w:cs="BIZ UDゴシック"/>
+          <w:rFonts w:ascii="BIZ UDPゴシック" w:hAnsi="BIZ UDPゴシック" w:eastAsia="BIZ UDPゴシック" w:cs="BIZ UDPゴシック"/>
           <w:b w:val="0"/>
           <w:color w:val="4A4440"/>
           <w:sz w:val="21"/>
@@ -1208,7 +1208,7 @@
       </w:r>
       <w:r>
         <w:rPr>
-          <w:rFonts w:ascii="BIZ UDゴシック" w:hAnsi="BIZ UDゴシック" w:eastAsia="BIZ UDゴシック" w:cs="BIZ UDゴシック"/>
+          <w:rFonts w:ascii="BIZ UDPゴシック" w:hAnsi="BIZ UDPゴシック" w:eastAsia="BIZ UDPゴシック" w:cs="BIZ UDPゴシック"/>
           <w:b/>
           <w:color w:val="8C6A3E"/>
           <w:sz w:val="21"/>
@@ -1217,7 +1217,7 @@
       </w:r>
       <w:r>
         <w:rPr>
-          <w:rFonts w:ascii="BIZ UDゴシック" w:hAnsi="BIZ UDゴシック" w:eastAsia="BIZ UDゴシック" w:cs="BIZ UDゴシック"/>
+          <w:rFonts w:ascii="BIZ UDPゴシック" w:hAnsi="BIZ UDPゴシック" w:eastAsia="BIZ UDPゴシック" w:cs="BIZ UDPゴシック"/>
           <w:b w:val="0"/>
           <w:color w:val="4A4440"/>
           <w:sz w:val="21"/>
@@ -1226,7 +1226,7 @@
       </w:r>
       <w:r>
         <w:rPr>
-          <w:rFonts w:ascii="BIZ UDゴシック" w:hAnsi="BIZ UDゴシック" w:eastAsia="BIZ UDゴシック" w:cs="BIZ UDゴシック"/>
+          <w:rFonts w:ascii="BIZ UDPゴシック" w:hAnsi="BIZ UDPゴシック" w:eastAsia="BIZ UDPゴシック" w:cs="BIZ UDPゴシック"/>
           <w:b/>
           <w:color w:val="8C6A3E"/>
           <w:sz w:val="21"/>
@@ -1235,7 +1235,7 @@
       </w:r>
       <w:r>
         <w:rPr>
-          <w:rFonts w:ascii="BIZ UDゴシック" w:hAnsi="BIZ UDゴシック" w:eastAsia="BIZ UDゴシック" w:cs="BIZ UDゴシック"/>
+          <w:rFonts w:ascii="BIZ UDPゴシック" w:hAnsi="BIZ UDPゴシック" w:eastAsia="BIZ UDPゴシック" w:cs="BIZ UDPゴシック"/>
           <w:b w:val="0"/>
           <w:color w:val="4A4440"/>
           <w:sz w:val="21"/>
@@ -1250,7 +1250,7 @@
       </w:pPr>
       <w:r>
         <w:rPr>
-          <w:rFonts w:ascii="BIZ UDゴシック" w:hAnsi="BIZ UDゴシック" w:eastAsia="BIZ UDゴシック" w:cs="BIZ UDゴシック"/>
+          <w:rFonts w:ascii="BIZ UDPゴシック" w:hAnsi="BIZ UDPゴシック" w:eastAsia="BIZ UDPゴシック" w:cs="BIZ UDPゴシック"/>
           <w:b w:val="0"/>
           <w:color w:val="4A4440"/>
           <w:sz w:val="21"/>
@@ -1259,7 +1259,7 @@
       </w:r>
       <w:r>
         <w:rPr>
-          <w:rFonts w:ascii="BIZ UDゴシック" w:hAnsi="BIZ UDゴシック" w:eastAsia="BIZ UDゴシック" w:cs="BIZ UDゴシック"/>
+          <w:rFonts w:ascii="BIZ UDPゴシック" w:hAnsi="BIZ UDPゴシック" w:eastAsia="BIZ UDPゴシック" w:cs="BIZ UDPゴシック"/>
           <w:b/>
           <w:color w:val="8C6A3E"/>
           <w:sz w:val="21"/>
@@ -1268,7 +1268,7 @@
       </w:r>
       <w:r>
         <w:rPr>
-          <w:rFonts w:ascii="BIZ UDゴシック" w:hAnsi="BIZ UDゴシック" w:eastAsia="BIZ UDゴシック" w:cs="BIZ UDゴシック"/>
+          <w:rFonts w:ascii="BIZ UDPゴシック" w:hAnsi="BIZ UDPゴシック" w:eastAsia="BIZ UDPゴシック" w:cs="BIZ UDPゴシック"/>
           <w:b w:val="0"/>
           <w:color w:val="4A4440"/>
           <w:sz w:val="21"/>
@@ -1277,7 +1277,7 @@
       </w:r>
       <w:r>
         <w:rPr>
-          <w:rFonts w:ascii="BIZ UDゴシック" w:hAnsi="BIZ UDゴシック" w:eastAsia="BIZ UDゴシック" w:cs="BIZ UDゴシック"/>
+          <w:rFonts w:ascii="BIZ UDPゴシック" w:hAnsi="BIZ UDPゴシック" w:eastAsia="BIZ UDPゴシック" w:cs="BIZ UDPゴシック"/>
           <w:b/>
           <w:color w:val="8C6A3E"/>
           <w:sz w:val="21"/>
@@ -1286,7 +1286,7 @@
       </w:r>
       <w:r>
         <w:rPr>
-          <w:rFonts w:ascii="BIZ UDゴシック" w:hAnsi="BIZ UDゴシック" w:eastAsia="BIZ UDゴシック" w:cs="BIZ UDゴシック"/>
+          <w:rFonts w:ascii="BIZ UDPゴシック" w:hAnsi="BIZ UDPゴシック" w:eastAsia="BIZ UDPゴシック" w:cs="BIZ UDPゴシック"/>
           <w:b w:val="0"/>
           <w:color w:val="4A4440"/>
           <w:sz w:val="21"/>
@@ -1301,7 +1301,7 @@
       </w:pPr>
       <w:r>
         <w:rPr>
-          <w:rFonts w:ascii="BIZ UDゴシック" w:hAnsi="BIZ UDゴシック" w:eastAsia="BIZ UDゴシック" w:cs="BIZ UDゴシック"/>
+          <w:rFonts w:ascii="BIZ UDPゴシック" w:hAnsi="BIZ UDPゴシック" w:eastAsia="BIZ UDPゴシック" w:cs="BIZ UDPゴシック"/>
           <w:b w:val="0"/>
           <w:color w:val="4A4440"/>
           <w:sz w:val="21"/>
@@ -1310,7 +1310,7 @@
       </w:r>
       <w:r>
         <w:rPr>
-          <w:rFonts w:ascii="BIZ UDゴシック" w:hAnsi="BIZ UDゴシック" w:eastAsia="BIZ UDゴシック" w:cs="BIZ UDゴシック"/>
+          <w:rFonts w:ascii="BIZ UDPゴシック" w:hAnsi="BIZ UDPゴシック" w:eastAsia="BIZ UDPゴシック" w:cs="BIZ UDPゴシック"/>
           <w:b/>
           <w:color w:val="8C6A3E"/>
           <w:sz w:val="21"/>
@@ -1319,7 +1319,7 @@
       </w:r>
       <w:r>
         <w:rPr>
-          <w:rFonts w:ascii="BIZ UDゴシック" w:hAnsi="BIZ UDゴシック" w:eastAsia="BIZ UDゴシック" w:cs="BIZ UDゴシック"/>
+          <w:rFonts w:ascii="BIZ UDPゴシック" w:hAnsi="BIZ UDPゴシック" w:eastAsia="BIZ UDPゴシック" w:cs="BIZ UDPゴシック"/>
           <w:b w:val="0"/>
           <w:color w:val="4A4440"/>
           <w:sz w:val="21"/>
@@ -1328,7 +1328,7 @@
       </w:r>
       <w:r>
         <w:rPr>
-          <w:rFonts w:ascii="BIZ UDゴシック" w:hAnsi="BIZ UDゴシック" w:eastAsia="BIZ UDゴシック" w:cs="BIZ UDゴシック"/>
+          <w:rFonts w:ascii="BIZ UDPゴシック" w:hAnsi="BIZ UDPゴシック" w:eastAsia="BIZ UDPゴシック" w:cs="BIZ UDPゴシック"/>
           <w:b/>
           <w:color w:val="8C6A3E"/>
           <w:sz w:val="21"/>
@@ -1337,7 +1337,7 @@
       </w:r>
       <w:r>
         <w:rPr>
-          <w:rFonts w:ascii="BIZ UDゴシック" w:hAnsi="BIZ UDゴシック" w:eastAsia="BIZ UDゴシック" w:cs="BIZ UDゴシック"/>
+          <w:rFonts w:ascii="BIZ UDPゴシック" w:hAnsi="BIZ UDPゴシック" w:eastAsia="BIZ UDPゴシック" w:cs="BIZ UDPゴシック"/>
           <w:b w:val="0"/>
           <w:color w:val="4A4440"/>
           <w:sz w:val="21"/>
@@ -1346,7 +1346,7 @@
       </w:r>
       <w:r>
         <w:rPr>
-          <w:rFonts w:ascii="BIZ UDゴシック" w:hAnsi="BIZ UDゴシック" w:eastAsia="BIZ UDゴシック" w:cs="BIZ UDゴシック"/>
+          <w:rFonts w:ascii="BIZ UDPゴシック" w:hAnsi="BIZ UDPゴシック" w:eastAsia="BIZ UDPゴシック" w:cs="BIZ UDPゴシック"/>
           <w:b/>
           <w:color w:val="8C6A3E"/>
           <w:sz w:val="21"/>
@@ -1355,7 +1355,7 @@
       </w:r>
       <w:r>
         <w:rPr>
-          <w:rFonts w:ascii="BIZ UDゴシック" w:hAnsi="BIZ UDゴシック" w:eastAsia="BIZ UDゴシック" w:cs="BIZ UDゴシック"/>
+          <w:rFonts w:ascii="BIZ UDPゴシック" w:hAnsi="BIZ UDPゴシック" w:eastAsia="BIZ UDPゴシック" w:cs="BIZ UDPゴシック"/>
           <w:b w:val="0"/>
           <w:color w:val="4A4440"/>
           <w:sz w:val="21"/>
@@ -1370,7 +1370,7 @@
       </w:pPr>
       <w:r>
         <w:rPr>
-          <w:rFonts w:ascii="BIZ UDゴシック" w:hAnsi="BIZ UDゴシック" w:eastAsia="BIZ UDゴシック" w:cs="BIZ UDゴシック"/>
+          <w:rFonts w:ascii="BIZ UDPゴシック" w:hAnsi="BIZ UDPゴシック" w:eastAsia="BIZ UDPゴシック" w:cs="BIZ UDPゴシック"/>
           <w:b w:val="0"/>
           <w:color w:val="4A4440"/>
           <w:sz w:val="21"/>
@@ -1379,7 +1379,7 @@
       </w:r>
       <w:r>
         <w:rPr>
-          <w:rFonts w:ascii="BIZ UDゴシック" w:hAnsi="BIZ UDゴシック" w:eastAsia="BIZ UDゴシック" w:cs="BIZ UDゴシック"/>
+          <w:rFonts w:ascii="BIZ UDPゴシック" w:hAnsi="BIZ UDPゴシック" w:eastAsia="BIZ UDPゴシック" w:cs="BIZ UDPゴシック"/>
           <w:b/>
           <w:color w:val="8C6A3E"/>
           <w:sz w:val="21"/>
@@ -1388,7 +1388,7 @@
       </w:r>
       <w:r>
         <w:rPr>
-          <w:rFonts w:ascii="BIZ UDゴシック" w:hAnsi="BIZ UDゴシック" w:eastAsia="BIZ UDゴシック" w:cs="BIZ UDゴシック"/>
+          <w:rFonts w:ascii="BIZ UDPゴシック" w:hAnsi="BIZ UDPゴシック" w:eastAsia="BIZ UDPゴシック" w:cs="BIZ UDPゴシック"/>
           <w:b w:val="0"/>
           <w:color w:val="4A4440"/>
           <w:sz w:val="21"/>
@@ -1397,7 +1397,7 @@
       </w:r>
       <w:r>
         <w:rPr>
-          <w:rFonts w:ascii="BIZ UDゴシック" w:hAnsi="BIZ UDゴシック" w:eastAsia="BIZ UDゴシック" w:cs="BIZ UDゴシック"/>
+          <w:rFonts w:ascii="BIZ UDPゴシック" w:hAnsi="BIZ UDPゴシック" w:eastAsia="BIZ UDPゴシック" w:cs="BIZ UDPゴシック"/>
           <w:b/>
           <w:color w:val="8C6A3E"/>
           <w:sz w:val="21"/>
@@ -1406,7 +1406,7 @@
       </w:r>
       <w:r>
         <w:rPr>
-          <w:rFonts w:ascii="BIZ UDゴシック" w:hAnsi="BIZ UDゴシック" w:eastAsia="BIZ UDゴシック" w:cs="BIZ UDゴシック"/>
+          <w:rFonts w:ascii="BIZ UDPゴシック" w:hAnsi="BIZ UDPゴシック" w:eastAsia="BIZ UDPゴシック" w:cs="BIZ UDPゴシック"/>
           <w:b w:val="0"/>
           <w:color w:val="4A4440"/>
           <w:sz w:val="21"/>
@@ -1421,7 +1421,7 @@
       </w:pPr>
       <w:r>
         <w:rPr>
-          <w:rFonts w:ascii="BIZ UDゴシック" w:hAnsi="BIZ UDゴシック" w:eastAsia="BIZ UDゴシック" w:cs="BIZ UDゴシック"/>
+          <w:rFonts w:ascii="BIZ UDPゴシック" w:hAnsi="BIZ UDPゴシック" w:eastAsia="BIZ UDPゴシック" w:cs="BIZ UDPゴシック"/>
           <w:b/>
           <w:color w:val="8C6A3E"/>
           <w:sz w:val="21"/>
@@ -1430,7 +1430,7 @@
       </w:r>
       <w:r>
         <w:rPr>
-          <w:rFonts w:ascii="BIZ UDゴシック" w:hAnsi="BIZ UDゴシック" w:eastAsia="BIZ UDゴシック" w:cs="BIZ UDゴシック"/>
+          <w:rFonts w:ascii="BIZ UDPゴシック" w:hAnsi="BIZ UDPゴシック" w:eastAsia="BIZ UDPゴシック" w:cs="BIZ UDPゴシック"/>
           <w:b w:val="0"/>
           <w:color w:val="4A4440"/>
           <w:sz w:val="21"/>
@@ -1439,7 +1439,7 @@
       </w:r>
       <w:r>
         <w:rPr>
-          <w:rFonts w:ascii="BIZ UDゴシック" w:hAnsi="BIZ UDゴシック" w:eastAsia="BIZ UDゴシック" w:cs="BIZ UDゴシック"/>
+          <w:rFonts w:ascii="BIZ UDPゴシック" w:hAnsi="BIZ UDPゴシック" w:eastAsia="BIZ UDPゴシック" w:cs="BIZ UDPゴシック"/>
           <w:b/>
           <w:color w:val="8C6A3E"/>
           <w:sz w:val="21"/>
@@ -1448,7 +1448,7 @@
       </w:r>
       <w:r>
         <w:rPr>
-          <w:rFonts w:ascii="BIZ UDゴシック" w:hAnsi="BIZ UDゴシック" w:eastAsia="BIZ UDゴシック" w:cs="BIZ UDゴシック"/>
+          <w:rFonts w:ascii="BIZ UDPゴシック" w:hAnsi="BIZ UDPゴシック" w:eastAsia="BIZ UDPゴシック" w:cs="BIZ UDPゴシック"/>
           <w:b w:val="0"/>
           <w:color w:val="4A4440"/>
           <w:sz w:val="21"/>
@@ -1465,7 +1465,7 @@
       </w:pPr>
       <w:r>
         <w:rPr>
-          <w:rFonts w:ascii="BIZ UDゴシック" w:hAnsi="BIZ UDゴシック" w:eastAsia="BIZ UDゴシック" w:cs="BIZ UDゴシック"/>
+          <w:rFonts w:ascii="BIZ UDPゴシック" w:hAnsi="BIZ UDPゴシック" w:eastAsia="BIZ UDPゴシック" w:cs="BIZ UDPゴシック"/>
           <w:b/>
           <w:color w:val="8C6A3E"/>
           <w:sz w:val="22"/>
@@ -1474,7 +1474,7 @@
       </w:r>
       <w:r>
         <w:rPr>
-          <w:rFonts w:ascii="BIZ UDゴシック" w:hAnsi="BIZ UDゴシック" w:eastAsia="BIZ UDゴシック" w:cs="BIZ UDゴシック"/>
+          <w:rFonts w:ascii="BIZ UDPゴシック" w:hAnsi="BIZ UDPゴシック" w:eastAsia="BIZ UDPゴシック" w:cs="BIZ UDPゴシック"/>
           <w:b/>
           <w:color w:val="2F5B54"/>
           <w:sz w:val="24"/>
@@ -1489,7 +1489,7 @@
       </w:pPr>
       <w:r>
         <w:rPr>
-          <w:rFonts w:ascii="BIZ UDゴシック" w:hAnsi="BIZ UDゴシック" w:eastAsia="BIZ UDゴシック" w:cs="BIZ UDゴシック"/>
+          <w:rFonts w:ascii="BIZ UDPゴシック" w:hAnsi="BIZ UDPゴシック" w:eastAsia="BIZ UDPゴシック" w:cs="BIZ UDPゴシック"/>
           <w:b/>
           <w:color w:val="8C6A3E"/>
           <w:sz w:val="21"/>
@@ -1498,7 +1498,7 @@
       </w:r>
       <w:r>
         <w:rPr>
-          <w:rFonts w:ascii="BIZ UDゴシック" w:hAnsi="BIZ UDゴシック" w:eastAsia="BIZ UDゴシック" w:cs="BIZ UDゴシック"/>
+          <w:rFonts w:ascii="BIZ UDPゴシック" w:hAnsi="BIZ UDPゴシック" w:eastAsia="BIZ UDPゴシック" w:cs="BIZ UDPゴシック"/>
           <w:b w:val="0"/>
           <w:color w:val="4A4440"/>
           <w:sz w:val="21"/>
@@ -1507,7 +1507,7 @@
       </w:r>
       <w:r>
         <w:rPr>
-          <w:rFonts w:ascii="BIZ UDゴシック" w:hAnsi="BIZ UDゴシック" w:eastAsia="BIZ UDゴシック" w:cs="BIZ UDゴシック"/>
+          <w:rFonts w:ascii="BIZ UDPゴシック" w:hAnsi="BIZ UDPゴシック" w:eastAsia="BIZ UDPゴシック" w:cs="BIZ UDPゴシック"/>
           <w:b/>
           <w:color w:val="8C6A3E"/>
           <w:sz w:val="21"/>
@@ -1516,7 +1516,7 @@
       </w:r>
       <w:r>
         <w:rPr>
-          <w:rFonts w:ascii="BIZ UDゴシック" w:hAnsi="BIZ UDゴシック" w:eastAsia="BIZ UDゴシック" w:cs="BIZ UDゴシック"/>
+          <w:rFonts w:ascii="BIZ UDPゴシック" w:hAnsi="BIZ UDPゴシック" w:eastAsia="BIZ UDPゴシック" w:cs="BIZ UDPゴシック"/>
           <w:b w:val="0"/>
           <w:color w:val="4A4440"/>
           <w:sz w:val="21"/>
@@ -1531,7 +1531,7 @@
       </w:pPr>
       <w:r>
         <w:rPr>
-          <w:rFonts w:ascii="BIZ UDゴシック" w:hAnsi="BIZ UDゴシック" w:eastAsia="BIZ UDゴシック" w:cs="BIZ UDゴシック"/>
+          <w:rFonts w:ascii="BIZ UDPゴシック" w:hAnsi="BIZ UDPゴシック" w:eastAsia="BIZ UDPゴシック" w:cs="BIZ UDPゴシック"/>
           <w:b/>
           <w:color w:val="8C6A3E"/>
           <w:sz w:val="21"/>
@@ -1540,7 +1540,7 @@
       </w:r>
       <w:r>
         <w:rPr>
-          <w:rFonts w:ascii="BIZ UDゴシック" w:hAnsi="BIZ UDゴシック" w:eastAsia="BIZ UDゴシック" w:cs="BIZ UDゴシック"/>
+          <w:rFonts w:ascii="BIZ UDPゴシック" w:hAnsi="BIZ UDPゴシック" w:eastAsia="BIZ UDPゴシック" w:cs="BIZ UDPゴシック"/>
           <w:b w:val="0"/>
           <w:color w:val="4A4440"/>
           <w:sz w:val="21"/>
@@ -1549,7 +1549,7 @@
       </w:r>
       <w:r>
         <w:rPr>
-          <w:rFonts w:ascii="BIZ UDゴシック" w:hAnsi="BIZ UDゴシック" w:eastAsia="BIZ UDゴシック" w:cs="BIZ UDゴシック"/>
+          <w:rFonts w:ascii="BIZ UDPゴシック" w:hAnsi="BIZ UDPゴシック" w:eastAsia="BIZ UDPゴシック" w:cs="BIZ UDPゴシック"/>
           <w:b/>
           <w:color w:val="8C6A3E"/>
           <w:sz w:val="21"/>
@@ -1558,7 +1558,7 @@
       </w:r>
       <w:r>
         <w:rPr>
-          <w:rFonts w:ascii="BIZ UDゴシック" w:hAnsi="BIZ UDゴシック" w:eastAsia="BIZ UDゴシック" w:cs="BIZ UDゴシック"/>
+          <w:rFonts w:ascii="BIZ UDPゴシック" w:hAnsi="BIZ UDPゴシック" w:eastAsia="BIZ UDPゴシック" w:cs="BIZ UDPゴシック"/>
           <w:b w:val="0"/>
           <w:color w:val="4A4440"/>
           <w:sz w:val="21"/>
@@ -1573,7 +1573,7 @@
       </w:pPr>
       <w:r>
         <w:rPr>
-          <w:rFonts w:ascii="BIZ UDゴシック" w:hAnsi="BIZ UDゴシック" w:eastAsia="BIZ UDゴシック" w:cs="BIZ UDゴシック"/>
+          <w:rFonts w:ascii="BIZ UDPゴシック" w:hAnsi="BIZ UDPゴシック" w:eastAsia="BIZ UDPゴシック" w:cs="BIZ UDPゴシック"/>
           <w:b/>
           <w:color w:val="8C6A3E"/>
           <w:sz w:val="21"/>
@@ -1582,7 +1582,7 @@
       </w:r>
       <w:r>
         <w:rPr>
-          <w:rFonts w:ascii="BIZ UDゴシック" w:hAnsi="BIZ UDゴシック" w:eastAsia="BIZ UDゴシック" w:cs="BIZ UDゴシック"/>
+          <w:rFonts w:ascii="BIZ UDPゴシック" w:hAnsi="BIZ UDPゴシック" w:eastAsia="BIZ UDPゴシック" w:cs="BIZ UDPゴシック"/>
           <w:b w:val="0"/>
           <w:color w:val="4A4440"/>
           <w:sz w:val="21"/>
@@ -1591,7 +1591,7 @@
       </w:r>
       <w:r>
         <w:rPr>
-          <w:rFonts w:ascii="BIZ UDゴシック" w:hAnsi="BIZ UDゴシック" w:eastAsia="BIZ UDゴシック" w:cs="BIZ UDゴシック"/>
+          <w:rFonts w:ascii="BIZ UDPゴシック" w:hAnsi="BIZ UDPゴシック" w:eastAsia="BIZ UDPゴシック" w:cs="BIZ UDPゴシック"/>
           <w:b/>
           <w:color w:val="8C6A3E"/>
           <w:sz w:val="21"/>
@@ -1600,7 +1600,7 @@
       </w:r>
       <w:r>
         <w:rPr>
-          <w:rFonts w:ascii="BIZ UDゴシック" w:hAnsi="BIZ UDゴシック" w:eastAsia="BIZ UDゴシック" w:cs="BIZ UDゴシック"/>
+          <w:rFonts w:ascii="BIZ UDPゴシック" w:hAnsi="BIZ UDPゴシック" w:eastAsia="BIZ UDPゴシック" w:cs="BIZ UDPゴシック"/>
           <w:b w:val="0"/>
           <w:color w:val="4A4440"/>
           <w:sz w:val="21"/>
@@ -1647,7 +1647,7 @@
             </w:pPr>
             <w:r>
               <w:rPr>
-                <w:rFonts w:ascii="BIZ UDゴシック" w:hAnsi="BIZ UDゴシック" w:eastAsia="BIZ UDゴシック" w:cs="BIZ UDゴシック"/>
+                <w:rFonts w:ascii="BIZ UDPゴシック" w:hAnsi="BIZ UDPゴシック" w:eastAsia="BIZ UDPゴシック" w:cs="BIZ UDPゴシック"/>
                 <w:b/>
                 <w:color w:val="8C6A3E"/>
                 <w:sz w:val="21"/>
@@ -1656,7 +1656,7 @@
             </w:r>
             <w:r>
               <w:rPr>
-                <w:rFonts w:ascii="BIZ UDゴシック" w:hAnsi="BIZ UDゴシック" w:eastAsia="BIZ UDゴシック" w:cs="BIZ UDゴシック"/>
+                <w:rFonts w:ascii="BIZ UDPゴシック" w:hAnsi="BIZ UDPゴシック" w:eastAsia="BIZ UDPゴシック" w:cs="BIZ UDPゴシック"/>
                 <w:b/>
                 <w:color w:val="2F5B54"/>
                 <w:sz w:val="22"/>
@@ -1670,7 +1670,7 @@
             </w:pPr>
             <w:r>
               <w:rPr>
-                <w:rFonts w:ascii="BIZ UDゴシック" w:hAnsi="BIZ UDゴシック" w:eastAsia="BIZ UDゴシック" w:cs="BIZ UDゴシック"/>
+                <w:rFonts w:ascii="BIZ UDPゴシック" w:hAnsi="BIZ UDPゴシック" w:eastAsia="BIZ UDPゴシック" w:cs="BIZ UDPゴシック"/>
                 <w:b/>
                 <w:color w:val="8C6A3E"/>
                 <w:sz w:val="20"/>
@@ -1679,7 +1679,7 @@
             </w:r>
             <w:r>
               <w:rPr>
-                <w:rFonts w:ascii="BIZ UDゴシック" w:hAnsi="BIZ UDゴシック" w:eastAsia="BIZ UDゴシック" w:cs="BIZ UDゴシック"/>
+                <w:rFonts w:ascii="BIZ UDPゴシック" w:hAnsi="BIZ UDPゴシック" w:eastAsia="BIZ UDPゴシック" w:cs="BIZ UDPゴシック"/>
                 <w:b w:val="0"/>
                 <w:color w:val="4A4440"/>
                 <w:sz w:val="20"/>
@@ -1696,7 +1696,7 @@
       </w:pPr>
       <w:r>
         <w:rPr>
-          <w:rFonts w:ascii="BIZ UDゴシック" w:hAnsi="BIZ UDゴシック" w:eastAsia="BIZ UDゴシック" w:cs="BIZ UDゴシック"/>
+          <w:rFonts w:ascii="BIZ UDPゴシック" w:hAnsi="BIZ UDPゴシック" w:eastAsia="BIZ UDPゴシック" w:cs="BIZ UDPゴシック"/>
           <w:b w:val="0"/>
           <w:color w:val="4A4440"/>
           <w:sz w:val="12"/>
@@ -1712,7 +1712,7 @@
       </w:pPr>
       <w:r>
         <w:rPr>
-          <w:rFonts w:ascii="BIZ UDゴシック" w:hAnsi="BIZ UDゴシック" w:eastAsia="BIZ UDゴシック" w:cs="BIZ UDゴシック"/>
+          <w:rFonts w:ascii="BIZ UDPゴシック" w:hAnsi="BIZ UDPゴシック" w:eastAsia="BIZ UDPゴシック" w:cs="BIZ UDPゴシック"/>
           <w:b/>
           <w:color w:val="2F5B54"/>
           <w:sz w:val="20"/>
@@ -1727,7 +1727,7 @@
       </w:pPr>
       <w:r>
         <w:rPr>
-          <w:rFonts w:ascii="BIZ UDゴシック" w:hAnsi="BIZ UDゴシック" w:eastAsia="BIZ UDゴシック" w:cs="BIZ UDゴシック"/>
+          <w:rFonts w:ascii="BIZ UDPゴシック" w:hAnsi="BIZ UDPゴシック" w:eastAsia="BIZ UDPゴシック" w:cs="BIZ UDPゴシック"/>
           <w:b w:val="0"/>
           <w:color w:val="8C837B"/>
           <w:sz w:val="17"/>
@@ -1742,7 +1742,7 @@
       </w:pPr>
       <w:r>
         <w:rPr>
-          <w:rFonts w:ascii="BIZ UDゴシック" w:hAnsi="BIZ UDゴシック" w:eastAsia="BIZ UDゴシック" w:cs="BIZ UDゴシック"/>
+          <w:rFonts w:ascii="BIZ UDPゴシック" w:hAnsi="BIZ UDPゴシック" w:eastAsia="BIZ UDPゴシック" w:cs="BIZ UDPゴシック"/>
           <w:b w:val="0"/>
           <w:color w:val="8C837B"/>
           <w:sz w:val="17"/>
@@ -1757,7 +1757,7 @@
       </w:pPr>
       <w:r>
         <w:rPr>
-          <w:rFonts w:ascii="BIZ UDゴシック" w:hAnsi="BIZ UDゴシック" w:eastAsia="BIZ UDゴシック" w:cs="BIZ UDゴシック"/>
+          <w:rFonts w:ascii="BIZ UDPゴシック" w:hAnsi="BIZ UDPゴシック" w:eastAsia="BIZ UDPゴシック" w:cs="BIZ UDPゴシック"/>
           <w:b w:val="0"/>
           <w:color w:val="8C837B"/>
           <w:sz w:val="17"/>
@@ -1772,7 +1772,7 @@
       </w:pPr>
       <w:r>
         <w:rPr>
-          <w:rFonts w:ascii="BIZ UDゴシック" w:hAnsi="BIZ UDゴシック" w:eastAsia="BIZ UDゴシック" w:cs="BIZ UDゴシック"/>
+          <w:rFonts w:ascii="BIZ UDPゴシック" w:hAnsi="BIZ UDPゴシック" w:eastAsia="BIZ UDPゴシック" w:cs="BIZ UDPゴシック"/>
           <w:b w:val="0"/>
           <w:color w:val="8C837B"/>
           <w:sz w:val="17"/>
@@ -1787,7 +1787,7 @@
       </w:pPr>
       <w:r>
         <w:rPr>
-          <w:rFonts w:ascii="BIZ UDゴシック" w:hAnsi="BIZ UDゴシック" w:eastAsia="BIZ UDゴシック" w:cs="BIZ UDゴシック"/>
+          <w:rFonts w:ascii="BIZ UDPゴシック" w:hAnsi="BIZ UDPゴシック" w:eastAsia="BIZ UDPゴシック" w:cs="BIZ UDPゴシック"/>
           <w:b w:val="0"/>
           <w:color w:val="8C837B"/>
           <w:sz w:val="17"/>
@@ -1801,7 +1801,7 @@
       </w:pPr>
       <w:r>
         <w:rPr>
-          <w:rFonts w:ascii="BIZ UDゴシック" w:hAnsi="BIZ UDゴシック" w:eastAsia="BIZ UDゴシック" w:cs="BIZ UDゴシック"/>
+          <w:rFonts w:ascii="BIZ UDPゴシック" w:hAnsi="BIZ UDPゴシック" w:eastAsia="BIZ UDPゴシック" w:cs="BIZ UDPゴシック"/>
           <w:b w:val="0"/>
           <w:color w:val="8C837B"/>
           <w:sz w:val="17"/>
@@ -1845,7 +1845,7 @@
             </w:pPr>
             <w:r>
               <w:rPr>
-                <w:rFonts w:ascii="BIZ UDゴシック" w:hAnsi="BIZ UDゴシック" w:eastAsia="BIZ UDゴシック" w:cs="BIZ UDゴシック"/>
+                <w:rFonts w:ascii="BIZ UDPゴシック" w:hAnsi="BIZ UDPゴシック" w:eastAsia="BIZ UDPゴシック" w:cs="BIZ UDPゴシック"/>
                 <w:b/>
                 <w:color w:val="2F5B54"/>
                 <w:sz w:val="21"/>
@@ -1859,7 +1859,7 @@
             </w:pPr>
             <w:r>
               <w:rPr>
-                <w:rFonts w:ascii="BIZ UDゴシック" w:hAnsi="BIZ UDゴシック" w:eastAsia="BIZ UDゴシック" w:cs="BIZ UDゴシック"/>
+                <w:rFonts w:ascii="BIZ UDPゴシック" w:hAnsi="BIZ UDPゴシック" w:eastAsia="BIZ UDPゴシック" w:cs="BIZ UDPゴシック"/>
                 <w:b w:val="0"/>
                 <w:color w:val="4A4440"/>
                 <w:sz w:val="20"/>
@@ -1873,7 +1873,7 @@
             </w:pPr>
             <w:r>
               <w:rPr>
-                <w:rFonts w:ascii="BIZ UDゴシック" w:hAnsi="BIZ UDゴシック" w:eastAsia="BIZ UDゴシック" w:cs="BIZ UDゴシック"/>
+                <w:rFonts w:ascii="BIZ UDPゴシック" w:hAnsi="BIZ UDPゴシック" w:eastAsia="BIZ UDPゴシック" w:cs="BIZ UDPゴシック"/>
                 <w:b/>
                 <w:color w:val="2F5B54"/>
                 <w:sz w:val="19"/>
@@ -1887,7 +1887,7 @@
             </w:pPr>
             <w:r>
               <w:rPr>
-                <w:rFonts w:ascii="BIZ UDゴシック" w:hAnsi="BIZ UDゴシック" w:eastAsia="BIZ UDゴシック" w:cs="BIZ UDゴシック"/>
+                <w:rFonts w:ascii="BIZ UDPゴシック" w:hAnsi="BIZ UDPゴシック" w:eastAsia="BIZ UDPゴシック" w:cs="BIZ UDPゴシック"/>
                 <w:b w:val="0"/>
                 <w:color w:val="8C837B"/>
                 <w:sz w:val="18"/>
@@ -1901,7 +1901,7 @@
             </w:pPr>
             <w:r>
               <w:rPr>
-                <w:rFonts w:ascii="BIZ UDゴシック" w:hAnsi="BIZ UDゴシック" w:eastAsia="BIZ UDゴシック" w:cs="BIZ UDゴシック"/>
+                <w:rFonts w:ascii="BIZ UDPゴシック" w:hAnsi="BIZ UDPゴシック" w:eastAsia="BIZ UDPゴシック" w:cs="BIZ UDPゴシック"/>
                 <w:b w:val="0"/>
                 <w:color w:val="8C837B"/>
                 <w:sz w:val="18"/>
@@ -1918,7 +1918,7 @@
       </w:pPr>
       <w:r>
         <w:rPr>
-          <w:rFonts w:ascii="BIZ UDゴシック" w:hAnsi="BIZ UDゴシック" w:eastAsia="BIZ UDゴシック" w:cs="BIZ UDゴシック"/>
+          <w:rFonts w:ascii="BIZ UDPゴシック" w:hAnsi="BIZ UDPゴシック" w:eastAsia="BIZ UDPゴシック" w:cs="BIZ UDPゴシック"/>
           <w:b w:val="0"/>
           <w:color w:val="4A4440"/>
           <w:sz w:val="8"/>
@@ -1946,7 +1946,7 @@
     </w:pPr>
     <w:r>
       <w:rPr>
-        <w:rFonts w:ascii="BIZ UDゴシック" w:hAnsi="BIZ UDゴシック" w:eastAsia="BIZ UDゴシック" w:cs="BIZ UDゴシック"/>
+        <w:rFonts w:ascii="BIZ UDPゴシック" w:hAnsi="BIZ UDPゴシック" w:eastAsia="BIZ UDPゴシック" w:cs="BIZ UDPゴシック"/>
         <w:b w:val="0"/>
         <w:color w:val="8C837B"/>
         <w:sz w:val="16"/>
@@ -1955,7 +1955,7 @@
     </w:r>
     <w:r>
       <w:rPr>
-        <w:rFonts w:ascii="BIZ UDゴシック" w:hAnsi="BIZ UDゴシック" w:eastAsia="BIZ UDゴシック" w:cs="BIZ UDゴシック"/>
+        <w:rFonts w:ascii="BIZ UDPゴシック" w:hAnsi="BIZ UDPゴシック" w:eastAsia="BIZ UDPゴシック" w:cs="BIZ UDPゴシック"/>
         <w:b w:val="0"/>
         <w:color w:val="8C837B"/>
         <w:sz w:val="18"/>
@@ -2335,7 +2335,7 @@
       <w:spacing w:line="300" w:lineRule="auto" w:after="60"/>
     </w:pPr>
     <w:rPr>
-      <w:rFonts w:ascii="BIZ UDゴシック" w:hAnsi="BIZ UDゴシック" w:eastAsia="BIZ UDゴシック"/>
+      <w:rFonts w:ascii="BIZ UDPゴシック" w:hAnsi="BIZ UDPゴシック" w:eastAsia="BIZ UDPゴシック"/>
       <w:color w:val="4A4440"/>
       <w:sz w:val="21"/>
     </w:rPr>

</xml_diff>

<commit_message>
Correct social insurance and fixed-term guidance
</commit_message>
<xml_diff>
--- a/downloads/liberest-newsletter-2026-09-17.docx
+++ b/downloads/liberest-newsletter-2026-09-17.docx
@@ -423,7 +423,7 @@
           <w:color w:val="8C6A3E"/>
           <w:sz w:val="21"/>
         </w:rPr>
-        <w:t>「正社員との待遇の差について説明を求めることができます」という一文と、その申出先（部署名・担当者）</w:t>
+        <w:t>「正社員との待遇の差について説明を求めることができます」という一文</w:t>
       </w:r>
       <w:r>
         <w:rPr>
@@ -432,7 +432,7 @@
           <w:color w:val="4A4440"/>
           <w:sz w:val="21"/>
         </w:rPr>
-        <w:t>を書く欄が増えます</w:t>
+        <w:t>が増えます（国のひな形では、申出先の部署名・担当者を書く欄もあります）</w:t>
       </w:r>
     </w:p>
     <w:p>
@@ -1333,7 +1333,7 @@
           <w:color w:val="8C6A3E"/>
           <w:sz w:val="21"/>
         </w:rPr>
-        <w:t>従業員が51人以上</w:t>
+        <w:t>厚生年金の加入者が51人以上</w:t>
       </w:r>
       <w:r>
         <w:rPr>
@@ -1342,7 +1342,7 @@
           <w:color w:val="4A4440"/>
           <w:sz w:val="21"/>
         </w:rPr>
-        <w:t>の会社で、</w:t>
+        <w:t>の会社など（この人数に、週20時間の基準で加入する人は数えません）で、</w:t>
       </w:r>
       <w:r>
         <w:rPr>
@@ -1360,7 +1360,7 @@
           <w:color w:val="4A4440"/>
           <w:sz w:val="21"/>
         </w:rPr>
-        <w:t>働く方（学生を除く）</w:t>
+        <w:t>働く方（学生を除く。最低賃金の減額の特例を受けている方には、別の扱いがあります）</w:t>
       </w:r>
     </w:p>
     <w:p>

</xml_diff>